<commit_message>
Add BraTS AF=4 pipeline; clean up unnecessary files
- Add BraTS AF=4 preprocessing, training, comparison, and analysis scripts
- Add Documentation/main.tex (NeurIPS template), report.tex, references.bib
- Remove old src/preprocess_brats.py
- Update .gitignore: add data/brats/, LaTeX aux files, Documentation/*.pdf
- Update src/config.py with IN_CHANNELS=3 and BraTS paths
</commit_message>
<xml_diff>
--- a/Documentation/next_steps.docx
+++ b/Documentation/next_steps.docx
@@ -168,7 +168,21 @@
         <w:rPr>
           <w:lang w:val="fr-CH"/>
         </w:rPr>
-        <w:t>Industry is already moving this direction: Siemens (Deep Resolve), GE (AIR Recon DL), and Philips (SmartSpeed) all have FDA-cleared AI reconstruction products in clinical use.</w:t>
+        <w:t xml:space="preserve">Industry is already moving this </w:t>
+      </w:r>
+      <w:proofErr w:type="gramStart"/>
+      <w:r>
+        <w:rPr>
+          <w:lang w:val="fr-CH"/>
+        </w:rPr>
+        <w:t>direction:</w:t>
+      </w:r>
+      <w:proofErr w:type="gramEnd"/>
+      <w:r>
+        <w:rPr>
+          <w:lang w:val="fr-CH"/>
+        </w:rPr>
+        <w:t xml:space="preserve"> Siemens (Deep Resolve), GE (AIR Recon DL), and Philips (SmartSpeed) all have FDA-cleared AI reconstruction products in clinical use.</w:t>
       </w:r>
     </w:p>
     <w:p>
@@ -210,7 +224,23 @@
           <w:color w:val="2E75B6"/>
           <w:lang w:val="fr-CH"/>
         </w:rPr>
-        <w:t>1.2 Key Limitation: Lesion Risk</w:t>
+        <w:t xml:space="preserve">1.2 Key </w:t>
+      </w:r>
+      <w:proofErr w:type="gramStart"/>
+      <w:r>
+        <w:rPr>
+          <w:color w:val="2E75B6"/>
+          <w:lang w:val="fr-CH"/>
+        </w:rPr>
+        <w:t>Limitation:</w:t>
+      </w:r>
+      <w:proofErr w:type="gramEnd"/>
+      <w:r>
+        <w:rPr>
+          <w:color w:val="2E75B6"/>
+          <w:lang w:val="fr-CH"/>
+        </w:rPr>
+        <w:t xml:space="preserve"> Lesion Risk</w:t>
       </w:r>
     </w:p>
     <w:p>
@@ -224,8 +254,16 @@
         <w:rPr>
           <w:lang w:val="fr-CH"/>
         </w:rPr>
-        <w:t>The most serious clinical concern identified is the risk of missing pathology in reconstructed slices:</w:t>
-      </w:r>
+        <w:t xml:space="preserve">The most serious clinical concern identified is the risk of missing pathology in reconstructed </w:t>
+      </w:r>
+      <w:proofErr w:type="gramStart"/>
+      <w:r>
+        <w:rPr>
+          <w:lang w:val="fr-CH"/>
+        </w:rPr>
+        <w:t>slices:</w:t>
+      </w:r>
+      <w:proofErr w:type="gramEnd"/>
     </w:p>
     <w:p>
       <w:pPr>
@@ -479,7 +517,21 @@
         <w:rPr>
           <w:lang w:val="fr-CH"/>
         </w:rPr>
-        <w:t>This is not a blocker but a constraint: reconstructed slices should not be used as the sole basis for diagnosis without additional safeguards (see Section 2 — Adaptive Acquisition).</w:t>
+        <w:t xml:space="preserve">This is not a blocker but a </w:t>
+      </w:r>
+      <w:proofErr w:type="gramStart"/>
+      <w:r>
+        <w:rPr>
+          <w:lang w:val="fr-CH"/>
+        </w:rPr>
+        <w:t>constraint:</w:t>
+      </w:r>
+      <w:proofErr w:type="gramEnd"/>
+      <w:r>
+        <w:rPr>
+          <w:lang w:val="fr-CH"/>
+        </w:rPr>
+        <w:t xml:space="preserve"> reconstructed slices should not be used as the sole basis for diagnosis without additional safeguards (see Section 2 — Adaptive Acquisition).</w:t>
       </w:r>
     </w:p>
     <w:p>
@@ -1215,7 +1267,21 @@
         <w:rPr>
           <w:lang w:val="fr-CH"/>
         </w:rPr>
-        <w:t>The most clinically valuable extension identified is an adaptive scanning pipeline: acquire half the slices first, run anomaly detection, and only acquire the remaining slices if something suspicious is found.</w:t>
+        <w:t xml:space="preserve">The most clinically valuable extension identified is an adaptive scanning </w:t>
+      </w:r>
+      <w:proofErr w:type="gramStart"/>
+      <w:r>
+        <w:rPr>
+          <w:lang w:val="fr-CH"/>
+        </w:rPr>
+        <w:t>pipeline:</w:t>
+      </w:r>
+      <w:proofErr w:type="gramEnd"/>
+      <w:r>
+        <w:rPr>
+          <w:lang w:val="fr-CH"/>
+        </w:rPr>
+        <w:t xml:space="preserve"> acquire half the slices first, run anomaly detection, and only acquire the remaining slices if something suspicious is found.</w:t>
       </w:r>
     </w:p>
     <w:p>
@@ -2260,7 +2326,21 @@
         <w:rPr>
           <w:lang w:val="fr-CH"/>
         </w:rPr>
-        <w:t>Uncertainty quantification (see Section 3) provides a natural gate: high model uncertainty triggers full acquisition automatically.</w:t>
+        <w:t xml:space="preserve">Uncertainty quantification (see Section 3) provides a natural </w:t>
+      </w:r>
+      <w:proofErr w:type="gramStart"/>
+      <w:r>
+        <w:rPr>
+          <w:lang w:val="fr-CH"/>
+        </w:rPr>
+        <w:t>gate:</w:t>
+      </w:r>
+      <w:proofErr w:type="gramEnd"/>
+      <w:r>
+        <w:rPr>
+          <w:lang w:val="fr-CH"/>
+        </w:rPr>
+        <w:t xml:space="preserve"> high model uncertainty triggers full acquisition automatically.</w:t>
       </w:r>
     </w:p>
     <w:p>
@@ -2306,7 +2386,21 @@
         <w:rPr>
           <w:lang w:val="fr-CH"/>
         </w:rPr>
-        <w:t>Anomaly detector: trained on paired healthy/pathological scans with lesion masks.</w:t>
+        <w:t xml:space="preserve">Anomaly </w:t>
+      </w:r>
+      <w:proofErr w:type="gramStart"/>
+      <w:r>
+        <w:rPr>
+          <w:lang w:val="fr-CH"/>
+        </w:rPr>
+        <w:t>detector:</w:t>
+      </w:r>
+      <w:proofErr w:type="gramEnd"/>
+      <w:r>
+        <w:rPr>
+          <w:lang w:val="fr-CH"/>
+        </w:rPr>
+        <w:t xml:space="preserve"> trained on paired healthy/pathological scans with lesion masks.</w:t>
       </w:r>
     </w:p>
     <w:p>
@@ -2325,7 +2419,21 @@
         <w:rPr>
           <w:lang w:val="fr-CH"/>
         </w:rPr>
-        <w:t>Uncertainty estimator: Monte Carlo Dropout (already implementable in the current U-Net).</w:t>
+        <w:t xml:space="preserve">Uncertainty </w:t>
+      </w:r>
+      <w:proofErr w:type="gramStart"/>
+      <w:r>
+        <w:rPr>
+          <w:lang w:val="fr-CH"/>
+        </w:rPr>
+        <w:t>estimator:</w:t>
+      </w:r>
+      <w:proofErr w:type="gramEnd"/>
+      <w:r>
+        <w:rPr>
+          <w:lang w:val="fr-CH"/>
+        </w:rPr>
+        <w:t xml:space="preserve"> Monte Carlo Dropout (already implementable in the current U-Net).</w:t>
       </w:r>
     </w:p>
     <w:p>
@@ -2462,7 +2570,31 @@
           <w:szCs w:val="20"/>
           <w:lang w:val="fr-CH"/>
         </w:rPr>
-        <w:t>This idea is novel enough to be a distinct research contribution. The framing of 'conditional full acquisition triggered by AI uncertainty' does not appear to be widely implemented in the published literature and could form the basis of a follow-up paper.</w:t>
+        <w:t xml:space="preserve">This idea is novel enough to be a distinct research contribution. The framing of 'conditional full acquisition triggered by AI uncertainty' does not appear to be widely implemented in the published literature and could form the basis of </w:t>
+      </w:r>
+      <w:proofErr w:type="gramStart"/>
+      <w:r>
+        <w:rPr>
+          <w:i/>
+          <w:iCs/>
+          <w:color w:val="444444"/>
+          <w:sz w:val="20"/>
+          <w:szCs w:val="20"/>
+          <w:lang w:val="fr-CH"/>
+        </w:rPr>
+        <w:t>a</w:t>
+      </w:r>
+      <w:proofErr w:type="gramEnd"/>
+      <w:r>
+        <w:rPr>
+          <w:i/>
+          <w:iCs/>
+          <w:color w:val="444444"/>
+          <w:sz w:val="20"/>
+          <w:szCs w:val="20"/>
+          <w:lang w:val="fr-CH"/>
+        </w:rPr>
+        <w:t xml:space="preserve"> follow-up paper.</w:t>
       </w:r>
     </w:p>
     <w:p>
@@ -3468,7 +3600,35 @@
         <w:rPr>
           <w:lang w:val="fr-CH"/>
         </w:rPr>
-        <w:t>The critical clinical question this answers: does high uncertainty correlate with high reconstruction error? If yes, the model knows when it does not know — the foundation of a safe adaptive scanning system.</w:t>
+        <w:t xml:space="preserve">The critical clinical question this </w:t>
+      </w:r>
+      <w:proofErr w:type="gramStart"/>
+      <w:r>
+        <w:rPr>
+          <w:lang w:val="fr-CH"/>
+        </w:rPr>
+        <w:t>answers:</w:t>
+      </w:r>
+      <w:proofErr w:type="gramEnd"/>
+      <w:r>
+        <w:rPr>
+          <w:lang w:val="fr-CH"/>
+        </w:rPr>
+        <w:t xml:space="preserve"> does high uncertainty correlate with high reconstruction </w:t>
+      </w:r>
+      <w:proofErr w:type="gramStart"/>
+      <w:r>
+        <w:rPr>
+          <w:lang w:val="fr-CH"/>
+        </w:rPr>
+        <w:t>error?</w:t>
+      </w:r>
+      <w:proofErr w:type="gramEnd"/>
+      <w:r>
+        <w:rPr>
+          <w:lang w:val="fr-CH"/>
+        </w:rPr>
+        <w:t xml:space="preserve"> If yes, the model knows when it does not know — the foundation of a safe adaptive scanning system.</w:t>
       </w:r>
     </w:p>
     <w:p>
@@ -3596,8 +3756,16 @@
         <w:rPr>
           <w:lang w:val="fr-CH"/>
         </w:rPr>
-        <w:t>The current implementation already supports automated medical interpretation of explainability outputs using the Anthropic Claude API. Each sample's Grad-CAM and IG maps are sent alongside quantitative metrics and the model returns a structured clinical assessment covering:</w:t>
-      </w:r>
+        <w:t xml:space="preserve">The current implementation already supports automated medical interpretation of explainability outputs using the Anthropic Claude API. Each sample's Grad-CAM and IG maps are sent alongside quantitative metrics and the model returns a structured clinical assessment </w:t>
+      </w:r>
+      <w:proofErr w:type="gramStart"/>
+      <w:r>
+        <w:rPr>
+          <w:lang w:val="fr-CH"/>
+        </w:rPr>
+        <w:t>covering:</w:t>
+      </w:r>
+      <w:proofErr w:type="gramEnd"/>
     </w:p>
     <w:p>
       <w:pPr>
@@ -3764,7 +3932,21 @@
         <w:rPr>
           <w:lang w:val="fr-CH"/>
         </w:rPr>
-        <w:t>A second novel idea was proposed: the scanner acquires only the central region of interest at full resolution, and the AI reconstructs the peripheral edges. This is a spatial variant of the temporal interpolation already implemented.</w:t>
+        <w:t xml:space="preserve">A second novel idea was </w:t>
+      </w:r>
+      <w:proofErr w:type="gramStart"/>
+      <w:r>
+        <w:rPr>
+          <w:lang w:val="fr-CH"/>
+        </w:rPr>
+        <w:t>proposed:</w:t>
+      </w:r>
+      <w:proofErr w:type="gramEnd"/>
+      <w:r>
+        <w:rPr>
+          <w:lang w:val="fr-CH"/>
+        </w:rPr>
+        <w:t xml:space="preserve"> the scanner acquires only the central region of interest at full resolution, and the AI reconstructs the peripheral edges. This is a spatial variant of the temporal interpolation already implemented.</w:t>
       </w:r>
     </w:p>
     <w:p>
@@ -4124,7 +4306,21 @@
         <w:rPr>
           <w:lang w:val="fr-CH"/>
         </w:rPr>
-        <w:t>A sensible division of labour: the scanner does the hard part (center), AI does the easy part (edges).</w:t>
+        <w:t xml:space="preserve">A sensible division of </w:t>
+      </w:r>
+      <w:proofErr w:type="gramStart"/>
+      <w:r>
+        <w:rPr>
+          <w:lang w:val="fr-CH"/>
+        </w:rPr>
+        <w:t>labour:</w:t>
+      </w:r>
+      <w:proofErr w:type="gramEnd"/>
+      <w:r>
+        <w:rPr>
+          <w:lang w:val="fr-CH"/>
+        </w:rPr>
+        <w:t xml:space="preserve"> the scanner does the hard part (center), AI does the easy part (edges).</w:t>
       </w:r>
     </w:p>
     <w:p>
@@ -5704,6 +5900,7 @@
           <w:lang w:val="fr-CH"/>
         </w:rPr>
       </w:pPr>
+      <w:proofErr w:type="gramStart"/>
       <w:r>
         <w:rPr>
           <w:i/>
@@ -5713,7 +5910,19 @@
           <w:szCs w:val="18"/>
           <w:lang w:val="fr-CH"/>
         </w:rPr>
-        <w:t>Note: All results reported in this document are based on the IXI dataset (healthy volunteers only). Clinical validation on pathological cases is required before any of these methods could be considered for deployment. Regulatory approval (FDA, CE) requires extensive prospective clinical trial evidence.</w:t>
+        <w:t>Note:</w:t>
+      </w:r>
+      <w:proofErr w:type="gramEnd"/>
+      <w:r>
+        <w:rPr>
+          <w:i/>
+          <w:iCs/>
+          <w:color w:val="666666"/>
+          <w:sz w:val="18"/>
+          <w:szCs w:val="18"/>
+          <w:lang w:val="fr-CH"/>
+        </w:rPr>
+        <w:t xml:space="preserve"> All results reported in this document are based on the IXI dataset (healthy volunteers only). Clinical validation on pathological cases is required before any of these methods could be considered for deployment. Regulatory approval (FDA, CE) requires extensive prospective clinical trial evidence.</w:t>
       </w:r>
     </w:p>
     <w:sectPr>

</xml_diff>